<commit_message>
Guia AI_Agent v3.0 — incorpora Claude.ai como capa 0
- Nueva sección 2: Claude.ai como arquitecto del sistema
- Tabla comparativa Claude.ai vs Claude Code vs ask_ai
- Casos de uso específicos para Claude.ai en flujo Egakat
- Explicación del puente Claude.ai → Claude Code (el usuario como intermediario)
- Advertencia de seguridad: usuario es el filtro en Claude.ai (no hay sanitización)
- Numeración de secciones actualizada (1-11)
- Portada actualizada a v3.0

Co-Authored-By: Claude Sonnet 4.6 <noreply@anthropic.com>
</commit_message>
<xml_diff>
--- a/AI_Agent/Guia_AI_Agent_Egakat.docx
+++ b/AI_Agent/Guia_AI_Agent_Egakat.docx
@@ -26,7 +26,7 @@
           <w:color w:val="4472C4"/>
           <w:sz w:val="36"/>
         </w:rPr>
-        <w:t>Guía de Interacción — AI Safe Agent + Claude Code</w:t>
+        <w:t>Guía de Interacción — Claude.ai + Claude Code + Agentes</w:t>
       </w:r>
     </w:p>
     <w:p/>
@@ -40,7 +40,7 @@
           <w:color w:val="505050"/>
           <w:sz w:val="24"/>
         </w:rPr>
-        <w:t>Cómo trabajar con los agentes, Claude Code y ask_ai de forma coordinada</w:t>
+        <w:t>Cómo trabajar con Claude.ai, Claude Code, los agentes y ask_ai de forma coordinada</w:t>
       </w:r>
     </w:p>
     <w:p/>
@@ -51,7 +51,7 @@
       <w:r>
         <w:t>Sócrates Cabral  |  Control de Gestión y Mejora Continua  |  Egakat SPA</w:t>
         <w:br/>
-        <w:t>Versión 2.0  —  11/03/2026</w:t>
+        <w:t>Versión 3.0  —  11/03/2026</w:t>
       </w:r>
     </w:p>
     <w:p>
@@ -67,12 +67,12 @@
         <w:rPr>
           <w:color w:val="1F497D"/>
         </w:rPr>
-        <w:t>1. Visión general del sistema</w:t>
+        <w:t>1. Visión general del sistema — las 4 capas</w:t>
       </w:r>
     </w:p>
     <w:p>
       <w:r>
-        <w:t>El laboratorio de IA logístico de Egakat SPA está compuesto por tres capas que trabajan de forma coordinada. No son herramientas separadas — son una sola arquitectura:</w:t>
+        <w:t>El laboratorio de IA logístico de Egakat SPA tiene CUATRO capas que trabajan en secuencia. No son herramientas separadas — son una sola arquitectura coordinada. Cada capa tiene un rol distinto y un momento específico de uso:</w:t>
       </w:r>
     </w:p>
     <w:p/>
@@ -91,7 +91,7 @@
       <w:tr>
         <w:tc>
           <w:tcPr>
-            <w:tcW w:type="dxa" w:w="1984"/>
+            <w:tcW w:type="dxa" w:w="1701"/>
             <w:shd w:val="clear" w:color="auto" w:fill="1F497D"/>
           </w:tcPr>
           <w:p>
@@ -106,7 +106,7 @@
         </w:tc>
         <w:tc>
           <w:tcPr>
-            <w:tcW w:type="dxa" w:w="2268"/>
+            <w:tcW w:type="dxa" w:w="1984"/>
             <w:shd w:val="clear" w:color="auto" w:fill="1F497D"/>
           </w:tcPr>
           <w:p>
@@ -121,7 +121,7 @@
         </w:tc>
         <w:tc>
           <w:tcPr>
-            <w:tcW w:type="dxa" w:w="3969"/>
+            <w:tcW w:type="dxa" w:w="4535"/>
             <w:shd w:val="clear" w:color="auto" w:fill="1F497D"/>
           </w:tcPr>
           <w:p>
@@ -145,7 +145,7 @@
                 <w:b/>
                 <w:color w:val="FFFFFF"/>
               </w:rPr>
-              <w:t>Cuándo aparece</w:t>
+              <w:t>Cuándo usarla</w:t>
             </w:r>
           </w:p>
         </w:tc>
@@ -153,19 +153,67 @@
       <w:tr>
         <w:tc>
           <w:tcPr>
+            <w:tcW w:type="dxa" w:w="1701"/>
+            <w:shd w:val="clear" w:color="auto" w:fill="DCE6F1"/>
+          </w:tcPr>
+          <w:p>
+            <w:r>
+              <w:t>0 — Diseño</w:t>
+            </w:r>
+          </w:p>
+        </w:tc>
+        <w:tc>
+          <w:tcPr>
             <w:tcW w:type="dxa" w:w="1984"/>
             <w:shd w:val="clear" w:color="auto" w:fill="DCE6F1"/>
           </w:tcPr>
           <w:p>
             <w:r>
+              <w:t>Claude.ai</w:t>
+              <w:br/>
+              <w:t>(navegador web)</w:t>
+            </w:r>
+          </w:p>
+        </w:tc>
+        <w:tc>
+          <w:tcPr>
+            <w:tcW w:type="dxa" w:w="4535"/>
+            <w:shd w:val="clear" w:color="auto" w:fill="DCE6F1"/>
+          </w:tcPr>
+          <w:p>
+            <w:r>
+              <w:t>El arquitecto. Piensa, planifica y diseña sin tocar código. No tiene acceso al proyecto — trabaja solo con lo que tú le describes.</w:t>
+            </w:r>
+          </w:p>
+        </w:tc>
+        <w:tc>
+          <w:tcPr>
+            <w:tcW w:type="dxa" w:w="2551"/>
+            <w:shd w:val="clear" w:color="auto" w:fill="DCE6F1"/>
+          </w:tcPr>
+          <w:p>
+            <w:r>
+              <w:t>Al INICIAR un proyecto o tarea nueva. Antes de escribir una sola línea de código.</w:t>
+            </w:r>
+          </w:p>
+        </w:tc>
+      </w:tr>
+      <w:tr>
+        <w:tc>
+          <w:tcPr>
+            <w:tcW w:type="dxa" w:w="1701"/>
+            <w:shd w:val="clear" w:color="auto" w:fill="FFFFFF"/>
+          </w:tcPr>
+          <w:p>
+            <w:r>
               <w:t>1 — Orquestador</w:t>
             </w:r>
           </w:p>
         </w:tc>
         <w:tc>
           <w:tcPr>
-            <w:tcW w:type="dxa" w:w="2268"/>
-            <w:shd w:val="clear" w:color="auto" w:fill="DCE6F1"/>
+            <w:tcW w:type="dxa" w:w="1984"/>
+            <w:shd w:val="clear" w:color="auto" w:fill="FFFFFF"/>
           </w:tcPr>
           <w:p>
             <w:r>
@@ -177,23 +225,23 @@
         </w:tc>
         <w:tc>
           <w:tcPr>
-            <w:tcW w:type="dxa" w:w="3969"/>
-            <w:shd w:val="clear" w:color="auto" w:fill="DCE6F1"/>
-          </w:tcPr>
-          <w:p>
-            <w:r>
-              <w:t>El cerebro. Lee el proyecto, decide qué agente llamar, ejecuta código, interpreta resultados.</w:t>
+            <w:tcW w:type="dxa" w:w="4535"/>
+            <w:shd w:val="clear" w:color="auto" w:fill="FFFFFF"/>
+          </w:tcPr>
+          <w:p>
+            <w:r>
+              <w:t>El cerebro de ejecución. Lee el proyecto completo, decide qué agente llamar, ejecuta código, interpreta resultados y te entrega el output final.</w:t>
             </w:r>
           </w:p>
         </w:tc>
         <w:tc>
           <w:tcPr>
             <w:tcW w:type="dxa" w:w="2551"/>
-            <w:shd w:val="clear" w:color="auto" w:fill="DCE6F1"/>
-          </w:tcPr>
-          <w:p>
-            <w:r>
-              <w:t>Siempre que abres VS Code y trabajas con Claude</w:t>
+            <w:shd w:val="clear" w:color="auto" w:fill="FFFFFF"/>
+          </w:tcPr>
+          <w:p>
+            <w:r>
+              <w:t>Para implementar, debugear y construir. Trabaja sobre el código real.</w:t>
             </w:r>
           </w:p>
         </w:tc>
@@ -201,19 +249,19 @@
       <w:tr>
         <w:tc>
           <w:tcPr>
+            <w:tcW w:type="dxa" w:w="1701"/>
+            <w:shd w:val="clear" w:color="auto" w:fill="DCE6F1"/>
+          </w:tcPr>
+          <w:p>
+            <w:r>
+              <w:t>2 — Agentes</w:t>
+            </w:r>
+          </w:p>
+        </w:tc>
+        <w:tc>
+          <w:tcPr>
             <w:tcW w:type="dxa" w:w="1984"/>
-            <w:shd w:val="clear" w:color="auto" w:fill="FFFFFF"/>
-          </w:tcPr>
-          <w:p>
-            <w:r>
-              <w:t>2 — Agentes</w:t>
-            </w:r>
-          </w:p>
-        </w:tc>
-        <w:tc>
-          <w:tcPr>
-            <w:tcW w:type="dxa" w:w="2268"/>
-            <w:shd w:val="clear" w:color="auto" w:fill="FFFFFF"/>
+            <w:shd w:val="clear" w:color="auto" w:fill="DCE6F1"/>
           </w:tcPr>
           <w:p>
             <w:r>
@@ -227,12 +275,58 @@
         </w:tc>
         <w:tc>
           <w:tcPr>
-            <w:tcW w:type="dxa" w:w="3969"/>
+            <w:tcW w:type="dxa" w:w="4535"/>
+            <w:shd w:val="clear" w:color="auto" w:fill="DCE6F1"/>
+          </w:tcPr>
+          <w:p>
+            <w:r>
+              <w:t>Los especialistas. Cada uno ejecuta una tarea concreta: extraer datos, analizar, generar scripts, interactuar con OneDrive o crear DAX.</w:t>
+            </w:r>
+          </w:p>
+        </w:tc>
+        <w:tc>
+          <w:tcPr>
+            <w:tcW w:type="dxa" w:w="2551"/>
+            <w:shd w:val="clear" w:color="auto" w:fill="DCE6F1"/>
+          </w:tcPr>
+          <w:p>
+            <w:r>
+              <w:t>Claude Code los llama automáticamente. También puedes llamarlos tú desde terminal.</w:t>
+            </w:r>
+          </w:p>
+        </w:tc>
+      </w:tr>
+      <w:tr>
+        <w:tc>
+          <w:tcPr>
+            <w:tcW w:type="dxa" w:w="1701"/>
             <w:shd w:val="clear" w:color="auto" w:fill="FFFFFF"/>
           </w:tcPr>
           <w:p>
             <w:r>
-              <w:t>Especialistas. Cada uno hace una tarea concreta y devuelve el resultado a Claude Code.</w:t>
+              <w:t>3 — CLI rápido</w:t>
+            </w:r>
+          </w:p>
+        </w:tc>
+        <w:tc>
+          <w:tcPr>
+            <w:tcW w:type="dxa" w:w="1984"/>
+            <w:shd w:val="clear" w:color="auto" w:fill="FFFFFF"/>
+          </w:tcPr>
+          <w:p>
+            <w:r>
+              <w:t>ask_ai</w:t>
+            </w:r>
+          </w:p>
+        </w:tc>
+        <w:tc>
+          <w:tcPr>
+            <w:tcW w:type="dxa" w:w="4535"/>
+            <w:shd w:val="clear" w:color="auto" w:fill="FFFFFF"/>
+          </w:tcPr>
+          <w:p>
+            <w:r>
+              <w:t>El asistente de terminal. Consultas puntuales sin abrir VS Code ni una sesión completa.</w:t>
             </w:r>
           </w:p>
         </w:tc>
@@ -243,53 +337,7 @@
           </w:tcPr>
           <w:p>
             <w:r>
-              <w:t>Claude Code los llama automáticamente según la tarea</w:t>
-            </w:r>
-          </w:p>
-        </w:tc>
-      </w:tr>
-      <w:tr>
-        <w:tc>
-          <w:tcPr>
-            <w:tcW w:type="dxa" w:w="1984"/>
-            <w:shd w:val="clear" w:color="auto" w:fill="DCE6F1"/>
-          </w:tcPr>
-          <w:p>
-            <w:r>
-              <w:t>3 — CLI rápido</w:t>
-            </w:r>
-          </w:p>
-        </w:tc>
-        <w:tc>
-          <w:tcPr>
-            <w:tcW w:type="dxa" w:w="2268"/>
-            <w:shd w:val="clear" w:color="auto" w:fill="DCE6F1"/>
-          </w:tcPr>
-          <w:p>
-            <w:r>
-              <w:t>ask_ai</w:t>
-            </w:r>
-          </w:p>
-        </w:tc>
-        <w:tc>
-          <w:tcPr>
-            <w:tcW w:type="dxa" w:w="3969"/>
-            <w:shd w:val="clear" w:color="auto" w:fill="DCE6F1"/>
-          </w:tcPr>
-          <w:p>
-            <w:r>
-              <w:t>Asistente de terminal. Consultas rápidas sin abrir VS Code.</w:t>
-            </w:r>
-          </w:p>
-        </w:tc>
-        <w:tc>
-          <w:tcPr>
-            <w:tcW w:type="dxa" w:w="2551"/>
-            <w:shd w:val="clear" w:color="auto" w:fill="DCE6F1"/>
-          </w:tcPr>
-          <w:p>
-            <w:r>
-              <w:t>Tú lo llamas desde terminal cuando necesitas algo puntual</w:t>
+              <w:t>Cuando necesitas una respuesta rápida sobre un archivo o pregunta específica.</w:t>
             </w:r>
           </w:p>
         </w:tc>
@@ -312,7 +360,7 @@
         <w:rPr>
           <w:color w:val="323232"/>
         </w:rPr>
-        <w:t>Tú describes lo que necesitas. Claude Code decide qué agentes usar y en qué orden. Los agentes ejecutan. Tú recibes el resultado.</w:t>
+        <w:t>Piensa con Claude.ai  →  Ejecuta con Claude Code  →  Consulta rápida con ask_ai</w:t>
       </w:r>
     </w:p>
     <w:p/>
@@ -329,7 +377,832 @@
         <w:rPr>
           <w:color w:val="1F497D"/>
         </w:rPr>
-        <w:t>2. Cómo Claude Code orquesta los agentes</w:t>
+        <w:t>2. Claude.ai — el arquitecto del sistema</w:t>
+      </w:r>
+    </w:p>
+    <w:p>
+      <w:r>
+        <w:t>Claude.ai (claude.ai en el navegador) es la capa más estratégica del laboratorio. Es donde nace cada proyecto. No ejecuta código ni tiene acceso a tus archivos, pero tiene algo que las otras herramientas no tienen: conversación profunda y continua para pensar problemas complejos sin límite de contexto técnico.</w:t>
+      </w:r>
+    </w:p>
+    <w:p/>
+    <w:p>
+      <w:pPr>
+        <w:pStyle w:val="Heading2"/>
+      </w:pPr>
+      <w:r>
+        <w:rPr>
+          <w:color w:val="4472C4"/>
+        </w:rPr>
+        <w:t>Qué puede hacer Claude.ai que las otras capas no pueden</w:t>
+      </w:r>
+    </w:p>
+    <w:tbl>
+      <w:tblPr>
+        <w:tblStyle w:val="TableGrid"/>
+        <w:tblW w:type="auto" w:w="0"/>
+        <w:tblLook w:firstColumn="1" w:firstRow="1" w:lastColumn="0" w:lastRow="0" w:noHBand="0" w:noVBand="1" w:val="04A0"/>
+      </w:tblPr>
+      <w:tblGrid>
+        <w:gridCol w:w="2351"/>
+        <w:gridCol w:w="2351"/>
+        <w:gridCol w:w="2351"/>
+        <w:gridCol w:w="2351"/>
+      </w:tblGrid>
+      <w:tr>
+        <w:tc>
+          <w:tcPr>
+            <w:tcW w:type="dxa" w:w="4252"/>
+            <w:shd w:val="clear" w:color="auto" w:fill="1F497D"/>
+          </w:tcPr>
+          <w:p>
+            <w:r>
+              <w:rPr>
+                <w:b/>
+                <w:color w:val="FFFFFF"/>
+              </w:rPr>
+              <w:t>Capacidad</w:t>
+            </w:r>
+          </w:p>
+        </w:tc>
+        <w:tc>
+          <w:tcPr>
+            <w:tcW w:type="dxa" w:w="1701"/>
+            <w:shd w:val="clear" w:color="auto" w:fill="1F497D"/>
+          </w:tcPr>
+          <w:p>
+            <w:r>
+              <w:rPr>
+                <w:b/>
+                <w:color w:val="FFFFFF"/>
+              </w:rPr>
+              <w:t>Claude.ai</w:t>
+            </w:r>
+          </w:p>
+        </w:tc>
+        <w:tc>
+          <w:tcPr>
+            <w:tcW w:type="dxa" w:w="1984"/>
+            <w:shd w:val="clear" w:color="auto" w:fill="1F497D"/>
+          </w:tcPr>
+          <w:p>
+            <w:r>
+              <w:rPr>
+                <w:b/>
+                <w:color w:val="FFFFFF"/>
+              </w:rPr>
+              <w:t>Claude Code</w:t>
+            </w:r>
+          </w:p>
+        </w:tc>
+        <w:tc>
+          <w:tcPr>
+            <w:tcW w:type="dxa" w:w="1701"/>
+            <w:shd w:val="clear" w:color="auto" w:fill="1F497D"/>
+          </w:tcPr>
+          <w:p>
+            <w:r>
+              <w:rPr>
+                <w:b/>
+                <w:color w:val="FFFFFF"/>
+              </w:rPr>
+              <w:t>ask_ai</w:t>
+            </w:r>
+          </w:p>
+        </w:tc>
+      </w:tr>
+      <w:tr>
+        <w:tc>
+          <w:tcPr>
+            <w:tcW w:type="dxa" w:w="4252"/>
+            <w:shd w:val="clear" w:color="auto" w:fill="DCE6F1"/>
+          </w:tcPr>
+          <w:p>
+            <w:r>
+              <w:t>Diseñar arquitectura de un proyecto</w:t>
+            </w:r>
+          </w:p>
+        </w:tc>
+        <w:tc>
+          <w:tcPr>
+            <w:tcW w:type="dxa" w:w="1701"/>
+            <w:shd w:val="clear" w:color="auto" w:fill="DCE6F1"/>
+          </w:tcPr>
+          <w:p>
+            <w:r>
+              <w:t>✅ Ideal</w:t>
+            </w:r>
+          </w:p>
+        </w:tc>
+        <w:tc>
+          <w:tcPr>
+            <w:tcW w:type="dxa" w:w="1984"/>
+            <w:shd w:val="clear" w:color="auto" w:fill="DCE6F1"/>
+          </w:tcPr>
+          <w:p>
+            <w:r>
+              <w:t>⚠️ Puede</w:t>
+            </w:r>
+          </w:p>
+        </w:tc>
+        <w:tc>
+          <w:tcPr>
+            <w:tcW w:type="dxa" w:w="1701"/>
+            <w:shd w:val="clear" w:color="auto" w:fill="DCE6F1"/>
+          </w:tcPr>
+          <w:p>
+            <w:r>
+              <w:t>❌ No</w:t>
+            </w:r>
+          </w:p>
+        </w:tc>
+      </w:tr>
+      <w:tr>
+        <w:tc>
+          <w:tcPr>
+            <w:tcW w:type="dxa" w:w="4252"/>
+            <w:shd w:val="clear" w:color="auto" w:fill="FFFFFF"/>
+          </w:tcPr>
+          <w:p>
+            <w:r>
+              <w:t>Conversar en profundidad sin código</w:t>
+            </w:r>
+          </w:p>
+        </w:tc>
+        <w:tc>
+          <w:tcPr>
+            <w:tcW w:type="dxa" w:w="1701"/>
+            <w:shd w:val="clear" w:color="auto" w:fill="FFFFFF"/>
+          </w:tcPr>
+          <w:p>
+            <w:r>
+              <w:t>✅ Ideal</w:t>
+            </w:r>
+          </w:p>
+        </w:tc>
+        <w:tc>
+          <w:tcPr>
+            <w:tcW w:type="dxa" w:w="1984"/>
+            <w:shd w:val="clear" w:color="auto" w:fill="FFFFFF"/>
+          </w:tcPr>
+          <w:p>
+            <w:r>
+              <w:t>⚠️ Puede</w:t>
+            </w:r>
+          </w:p>
+        </w:tc>
+        <w:tc>
+          <w:tcPr>
+            <w:tcW w:type="dxa" w:w="1701"/>
+            <w:shd w:val="clear" w:color="auto" w:fill="FFFFFF"/>
+          </w:tcPr>
+          <w:p>
+            <w:r>
+              <w:t>❌ No</w:t>
+            </w:r>
+          </w:p>
+        </w:tc>
+      </w:tr>
+      <w:tr>
+        <w:tc>
+          <w:tcPr>
+            <w:tcW w:type="dxa" w:w="4252"/>
+            <w:shd w:val="clear" w:color="auto" w:fill="DCE6F1"/>
+          </w:tcPr>
+          <w:p>
+            <w:r>
+              <w:t>Revisar lógica de negocio en lenguaje natural</w:t>
+            </w:r>
+          </w:p>
+        </w:tc>
+        <w:tc>
+          <w:tcPr>
+            <w:tcW w:type="dxa" w:w="1701"/>
+            <w:shd w:val="clear" w:color="auto" w:fill="DCE6F1"/>
+          </w:tcPr>
+          <w:p>
+            <w:r>
+              <w:t>✅ Ideal</w:t>
+            </w:r>
+          </w:p>
+        </w:tc>
+        <w:tc>
+          <w:tcPr>
+            <w:tcW w:type="dxa" w:w="1984"/>
+            <w:shd w:val="clear" w:color="auto" w:fill="DCE6F1"/>
+          </w:tcPr>
+          <w:p>
+            <w:r>
+              <w:t>⚠️ Puede</w:t>
+            </w:r>
+          </w:p>
+        </w:tc>
+        <w:tc>
+          <w:tcPr>
+            <w:tcW w:type="dxa" w:w="1701"/>
+            <w:shd w:val="clear" w:color="auto" w:fill="DCE6F1"/>
+          </w:tcPr>
+          <w:p>
+            <w:r>
+              <w:t>❌ No</w:t>
+            </w:r>
+          </w:p>
+        </w:tc>
+      </w:tr>
+      <w:tr>
+        <w:tc>
+          <w:tcPr>
+            <w:tcW w:type="dxa" w:w="4252"/>
+            <w:shd w:val="clear" w:color="auto" w:fill="FFFFFF"/>
+          </w:tcPr>
+          <w:p>
+            <w:r>
+              <w:t>Acceder a archivos del proyecto</w:t>
+            </w:r>
+          </w:p>
+        </w:tc>
+        <w:tc>
+          <w:tcPr>
+            <w:tcW w:type="dxa" w:w="1701"/>
+            <w:shd w:val="clear" w:color="auto" w:fill="FFFFFF"/>
+          </w:tcPr>
+          <w:p>
+            <w:r>
+              <w:t>❌ No</w:t>
+            </w:r>
+          </w:p>
+        </w:tc>
+        <w:tc>
+          <w:tcPr>
+            <w:tcW w:type="dxa" w:w="1984"/>
+            <w:shd w:val="clear" w:color="auto" w:fill="FFFFFF"/>
+          </w:tcPr>
+          <w:p>
+            <w:r>
+              <w:t>✅ Sí</w:t>
+            </w:r>
+          </w:p>
+        </w:tc>
+        <w:tc>
+          <w:tcPr>
+            <w:tcW w:type="dxa" w:w="1701"/>
+            <w:shd w:val="clear" w:color="auto" w:fill="FFFFFF"/>
+          </w:tcPr>
+          <w:p>
+            <w:r>
+              <w:t>✅ Sí</w:t>
+            </w:r>
+          </w:p>
+        </w:tc>
+      </w:tr>
+      <w:tr>
+        <w:tc>
+          <w:tcPr>
+            <w:tcW w:type="dxa" w:w="4252"/>
+            <w:shd w:val="clear" w:color="auto" w:fill="DCE6F1"/>
+          </w:tcPr>
+          <w:p>
+            <w:r>
+              <w:t>Llamar a los agentes automáticamente</w:t>
+            </w:r>
+          </w:p>
+        </w:tc>
+        <w:tc>
+          <w:tcPr>
+            <w:tcW w:type="dxa" w:w="1701"/>
+            <w:shd w:val="clear" w:color="auto" w:fill="DCE6F1"/>
+          </w:tcPr>
+          <w:p>
+            <w:r>
+              <w:t>❌ No</w:t>
+            </w:r>
+          </w:p>
+        </w:tc>
+        <w:tc>
+          <w:tcPr>
+            <w:tcW w:type="dxa" w:w="1984"/>
+            <w:shd w:val="clear" w:color="auto" w:fill="DCE6F1"/>
+          </w:tcPr>
+          <w:p>
+            <w:r>
+              <w:t>✅ Sí</w:t>
+            </w:r>
+          </w:p>
+        </w:tc>
+        <w:tc>
+          <w:tcPr>
+            <w:tcW w:type="dxa" w:w="1701"/>
+            <w:shd w:val="clear" w:color="auto" w:fill="DCE6F1"/>
+          </w:tcPr>
+          <w:p>
+            <w:r>
+              <w:t>❌ No</w:t>
+            </w:r>
+          </w:p>
+        </w:tc>
+      </w:tr>
+      <w:tr>
+        <w:tc>
+          <w:tcPr>
+            <w:tcW w:type="dxa" w:w="4252"/>
+            <w:shd w:val="clear" w:color="auto" w:fill="FFFFFF"/>
+          </w:tcPr>
+          <w:p>
+            <w:r>
+              <w:t>Ejecutar código y ver resultados</w:t>
+            </w:r>
+          </w:p>
+        </w:tc>
+        <w:tc>
+          <w:tcPr>
+            <w:tcW w:type="dxa" w:w="1701"/>
+            <w:shd w:val="clear" w:color="auto" w:fill="FFFFFF"/>
+          </w:tcPr>
+          <w:p>
+            <w:r>
+              <w:t>❌ No</w:t>
+            </w:r>
+          </w:p>
+        </w:tc>
+        <w:tc>
+          <w:tcPr>
+            <w:tcW w:type="dxa" w:w="1984"/>
+            <w:shd w:val="clear" w:color="auto" w:fill="FFFFFF"/>
+          </w:tcPr>
+          <w:p>
+            <w:r>
+              <w:t>✅ Sí</w:t>
+            </w:r>
+          </w:p>
+        </w:tc>
+        <w:tc>
+          <w:tcPr>
+            <w:tcW w:type="dxa" w:w="1701"/>
+            <w:shd w:val="clear" w:color="auto" w:fill="FFFFFF"/>
+          </w:tcPr>
+          <w:p>
+            <w:r>
+              <w:t>✅ Parcial</w:t>
+            </w:r>
+          </w:p>
+        </w:tc>
+      </w:tr>
+      <w:tr>
+        <w:tc>
+          <w:tcPr>
+            <w:tcW w:type="dxa" w:w="4252"/>
+            <w:shd w:val="clear" w:color="auto" w:fill="DCE6F1"/>
+          </w:tcPr>
+          <w:p>
+            <w:r>
+              <w:t>Respuesta rápida desde terminal</w:t>
+            </w:r>
+          </w:p>
+        </w:tc>
+        <w:tc>
+          <w:tcPr>
+            <w:tcW w:type="dxa" w:w="1701"/>
+            <w:shd w:val="clear" w:color="auto" w:fill="DCE6F1"/>
+          </w:tcPr>
+          <w:p>
+            <w:r>
+              <w:t>❌ No</w:t>
+            </w:r>
+          </w:p>
+        </w:tc>
+        <w:tc>
+          <w:tcPr>
+            <w:tcW w:type="dxa" w:w="1984"/>
+            <w:shd w:val="clear" w:color="auto" w:fill="DCE6F1"/>
+          </w:tcPr>
+          <w:p>
+            <w:r>
+              <w:t>❌ No</w:t>
+            </w:r>
+          </w:p>
+        </w:tc>
+        <w:tc>
+          <w:tcPr>
+            <w:tcW w:type="dxa" w:w="1701"/>
+            <w:shd w:val="clear" w:color="auto" w:fill="DCE6F1"/>
+          </w:tcPr>
+          <w:p>
+            <w:r>
+              <w:t>✅ Ideal</w:t>
+            </w:r>
+          </w:p>
+        </w:tc>
+      </w:tr>
+      <w:tr>
+        <w:tc>
+          <w:tcPr>
+            <w:tcW w:type="dxa" w:w="4252"/>
+            <w:shd w:val="clear" w:color="auto" w:fill="FFFFFF"/>
+          </w:tcPr>
+          <w:p>
+            <w:r>
+              <w:t>Mantener contexto entre sesiones (memoria)</w:t>
+            </w:r>
+          </w:p>
+        </w:tc>
+        <w:tc>
+          <w:tcPr>
+            <w:tcW w:type="dxa" w:w="1701"/>
+            <w:shd w:val="clear" w:color="auto" w:fill="FFFFFF"/>
+          </w:tcPr>
+          <w:p>
+            <w:r>
+              <w:t>⚠️ Limitado</w:t>
+            </w:r>
+          </w:p>
+        </w:tc>
+        <w:tc>
+          <w:tcPr>
+            <w:tcW w:type="dxa" w:w="1984"/>
+            <w:shd w:val="clear" w:color="auto" w:fill="FFFFFF"/>
+          </w:tcPr>
+          <w:p>
+            <w:r>
+              <w:t>✅ MEMORY.md</w:t>
+            </w:r>
+          </w:p>
+        </w:tc>
+        <w:tc>
+          <w:tcPr>
+            <w:tcW w:type="dxa" w:w="1701"/>
+            <w:shd w:val="clear" w:color="auto" w:fill="FFFFFF"/>
+          </w:tcPr>
+          <w:p>
+            <w:r>
+              <w:t>❌ No</w:t>
+            </w:r>
+          </w:p>
+        </w:tc>
+      </w:tr>
+    </w:tbl>
+    <w:p/>
+    <w:p>
+      <w:pPr>
+        <w:pStyle w:val="Heading2"/>
+      </w:pPr>
+      <w:r>
+        <w:rPr>
+          <w:color w:val="4472C4"/>
+        </w:rPr>
+        <w:t>Cómo usar Claude.ai en tu flujo diario</w:t>
+      </w:r>
+    </w:p>
+    <w:p>
+      <w:r>
+        <w:t>Claude.ai es tu interlocutor para todo lo que requiere pensar antes de hacer. Úsalo para estas situaciones:</w:t>
+      </w:r>
+    </w:p>
+    <w:tbl>
+      <w:tblPr>
+        <w:tblStyle w:val="TableGrid"/>
+        <w:tblW w:type="auto" w:w="0"/>
+        <w:tblLook w:firstColumn="1" w:firstRow="1" w:lastColumn="0" w:lastRow="0" w:noHBand="0" w:noVBand="1" w:val="04A0"/>
+      </w:tblPr>
+      <w:tblGrid>
+        <w:gridCol w:w="3135"/>
+        <w:gridCol w:w="3135"/>
+        <w:gridCol w:w="3135"/>
+      </w:tblGrid>
+      <w:tr>
+        <w:tc>
+          <w:tcPr>
+            <w:tcW w:type="dxa" w:w="2268"/>
+            <w:shd w:val="clear" w:color="auto" w:fill="1F497D"/>
+          </w:tcPr>
+          <w:p>
+            <w:r>
+              <w:rPr>
+                <w:b/>
+                <w:color w:val="FFFFFF"/>
+              </w:rPr>
+              <w:t>Situación</w:t>
+            </w:r>
+          </w:p>
+        </w:tc>
+        <w:tc>
+          <w:tcPr>
+            <w:tcW w:type="dxa" w:w="3969"/>
+            <w:shd w:val="clear" w:color="auto" w:fill="1F497D"/>
+          </w:tcPr>
+          <w:p>
+            <w:r>
+              <w:rPr>
+                <w:b/>
+                <w:color w:val="FFFFFF"/>
+              </w:rPr>
+              <w:t>Qué le dices a Claude.ai</w:t>
+            </w:r>
+          </w:p>
+        </w:tc>
+        <w:tc>
+          <w:tcPr>
+            <w:tcW w:type="dxa" w:w="4535"/>
+            <w:shd w:val="clear" w:color="auto" w:fill="1F497D"/>
+          </w:tcPr>
+          <w:p>
+            <w:r>
+              <w:rPr>
+                <w:b/>
+                <w:color w:val="FFFFFF"/>
+              </w:rPr>
+              <w:t>Output esperado</w:t>
+            </w:r>
+          </w:p>
+        </w:tc>
+      </w:tr>
+      <w:tr>
+        <w:tc>
+          <w:tcPr>
+            <w:tcW w:type="dxa" w:w="2268"/>
+            <w:shd w:val="clear" w:color="auto" w:fill="DCE6F1"/>
+          </w:tcPr>
+          <w:p>
+            <w:r>
+              <w:t>Proyecto nuevo</w:t>
+            </w:r>
+          </w:p>
+        </w:tc>
+        <w:tc>
+          <w:tcPr>
+            <w:tcW w:type="dxa" w:w="3969"/>
+            <w:shd w:val="clear" w:color="auto" w:fill="DCE6F1"/>
+          </w:tcPr>
+          <w:p>
+            <w:r>
+              <w:t>"Necesito automatizar la descarga de X desde el portal Y. Ya tengo scripts similares para WMS. ¿Cómo estructuro el nuevo?"</w:t>
+            </w:r>
+          </w:p>
+        </w:tc>
+        <w:tc>
+          <w:tcPr>
+            <w:tcW w:type="dxa" w:w="4535"/>
+            <w:shd w:val="clear" w:color="auto" w:fill="DCE6F1"/>
+          </w:tcPr>
+          <w:p>
+            <w:r>
+              <w:t>Estructura del script: funciones, flujo, manejo de errores, convenciones</w:t>
+            </w:r>
+          </w:p>
+        </w:tc>
+      </w:tr>
+      <w:tr>
+        <w:tc>
+          <w:tcPr>
+            <w:tcW w:type="dxa" w:w="2268"/>
+            <w:shd w:val="clear" w:color="auto" w:fill="FFFFFF"/>
+          </w:tcPr>
+          <w:p>
+            <w:r>
+              <w:t>Decisión de arquitectura</w:t>
+            </w:r>
+          </w:p>
+        </w:tc>
+        <w:tc>
+          <w:tcPr>
+            <w:tcW w:type="dxa" w:w="3969"/>
+            <w:shd w:val="clear" w:color="auto" w:fill="FFFFFF"/>
+          </w:tcPr>
+          <w:p>
+            <w:r>
+              <w:t>"¿Conviene un agente separado para devoluciones o lo integro en wms_descarga.py?"</w:t>
+            </w:r>
+          </w:p>
+        </w:tc>
+        <w:tc>
+          <w:tcPr>
+            <w:tcW w:type="dxa" w:w="4535"/>
+            <w:shd w:val="clear" w:color="auto" w:fill="FFFFFF"/>
+          </w:tcPr>
+          <w:p>
+            <w:r>
+              <w:t>Análisis de pros/contras con recomendación concreta</w:t>
+            </w:r>
+          </w:p>
+        </w:tc>
+      </w:tr>
+      <w:tr>
+        <w:tc>
+          <w:tcPr>
+            <w:tcW w:type="dxa" w:w="2268"/>
+            <w:shd w:val="clear" w:color="auto" w:fill="DCE6F1"/>
+          </w:tcPr>
+          <w:p>
+            <w:r>
+              <w:t>Revisar lógica de negocio</w:t>
+            </w:r>
+          </w:p>
+        </w:tc>
+        <w:tc>
+          <w:tcPr>
+            <w:tcW w:type="dxa" w:w="3969"/>
+            <w:shd w:val="clear" w:color="auto" w:fill="DCE6F1"/>
+          </w:tcPr>
+          <w:p>
+            <w:r>
+              <w:t>"El cálculo de % bloqueado debe excluir pallets en tránsito. ¿Cómo lo modelo en DAX?"</w:t>
+            </w:r>
+          </w:p>
+        </w:tc>
+        <w:tc>
+          <w:tcPr>
+            <w:tcW w:type="dxa" w:w="4535"/>
+            <w:shd w:val="clear" w:color="auto" w:fill="DCE6F1"/>
+          </w:tcPr>
+          <w:p>
+            <w:r>
+              <w:t>Fórmula DAX con explicación de contexto de filtro</w:t>
+            </w:r>
+          </w:p>
+        </w:tc>
+      </w:tr>
+      <w:tr>
+        <w:tc>
+          <w:tcPr>
+            <w:tcW w:type="dxa" w:w="2268"/>
+            <w:shd w:val="clear" w:color="auto" w:fill="FFFFFF"/>
+          </w:tcPr>
+          <w:p>
+            <w:r>
+              <w:t>Preparar una reunión</w:t>
+            </w:r>
+          </w:p>
+        </w:tc>
+        <w:tc>
+          <w:tcPr>
+            <w:tcW w:type="dxa" w:w="3969"/>
+            <w:shd w:val="clear" w:color="auto" w:fill="FFFFFF"/>
+          </w:tcPr>
+          <w:p>
+            <w:r>
+              <w:t>"Necesito explicarle a gerencia el impacto del sistema de automatización. Ayúdame a estructurar los puntos clave."</w:t>
+            </w:r>
+          </w:p>
+        </w:tc>
+        <w:tc>
+          <w:tcPr>
+            <w:tcW w:type="dxa" w:w="4535"/>
+            <w:shd w:val="clear" w:color="auto" w:fill="FFFFFF"/>
+          </w:tcPr>
+          <w:p>
+            <w:r>
+              <w:t>Estructura de presentación con argumentos y datos</w:t>
+            </w:r>
+          </w:p>
+        </w:tc>
+      </w:tr>
+      <w:tr>
+        <w:tc>
+          <w:tcPr>
+            <w:tcW w:type="dxa" w:w="2268"/>
+            <w:shd w:val="clear" w:color="auto" w:fill="DCE6F1"/>
+          </w:tcPr>
+          <w:p>
+            <w:r>
+              <w:t>Diagnosticar un problema complejo</w:t>
+            </w:r>
+          </w:p>
+        </w:tc>
+        <w:tc>
+          <w:tcPr>
+            <w:tcW w:type="dxa" w:w="3969"/>
+            <w:shd w:val="clear" w:color="auto" w:fill="DCE6F1"/>
+          </w:tcPr>
+          <w:p>
+            <w:r>
+              <w:t>"El script de staging falla solo los lunes. Estos son los logs: [pega logs]"</w:t>
+            </w:r>
+          </w:p>
+        </w:tc>
+        <w:tc>
+          <w:tcPr>
+            <w:tcW w:type="dxa" w:w="4535"/>
+            <w:shd w:val="clear" w:color="auto" w:fill="DCE6F1"/>
+          </w:tcPr>
+          <w:p>
+            <w:r>
+              <w:t>Hipótesis de causa raíz y pasos de diagnóstico</w:t>
+            </w:r>
+          </w:p>
+        </w:tc>
+      </w:tr>
+    </w:tbl>
+    <w:p/>
+    <w:p>
+      <w:pPr>
+        <w:pStyle w:val="Heading2"/>
+      </w:pPr>
+      <w:r>
+        <w:rPr>
+          <w:color w:val="4472C4"/>
+        </w:rPr>
+        <w:t>El puente Claude.ai → Claude Code</w:t>
+      </w:r>
+    </w:p>
+    <w:p>
+      <w:r>
+        <w:t>Claude.ai no guarda tu proyecto. Cuando terminas el diseño en Claude.ai y pasas a Claude Code para implementar, el puente eres TÚ: copias el plan o la estructura y se lo das a Claude Code para que lo ejecute.</w:t>
+      </w:r>
+    </w:p>
+    <w:p>
+      <w:pPr>
+        <w:ind w:left="283"/>
+      </w:pPr>
+      <w:r>
+        <w:rPr>
+          <w:b/>
+          <w:color w:val="1F497D"/>
+        </w:rPr>
+        <w:t xml:space="preserve">En Claude.ai:  </w:t>
+      </w:r>
+      <w:r>
+        <w:t>Diseñas la estructura del script de devoluciones. Claude.ai te da el esquema completo.</w:t>
+      </w:r>
+    </w:p>
+    <w:p>
+      <w:pPr>
+        <w:ind w:left="283"/>
+      </w:pPr>
+      <w:r>
+        <w:rPr>
+          <w:b/>
+          <w:color w:val="1F497D"/>
+        </w:rPr>
+        <w:t xml:space="preserve">Copias el plan:  </w:t>
+      </w:r>
+      <w:r>
+        <w:t>Tomas la estructura que Claude.ai propuso.</w:t>
+      </w:r>
+    </w:p>
+    <w:p>
+      <w:pPr>
+        <w:ind w:left="283"/>
+      </w:pPr>
+      <w:r>
+        <w:rPr>
+          <w:b/>
+          <w:color w:val="1F497D"/>
+        </w:rPr>
+        <w:t xml:space="preserve">En Claude Code:  </w:t>
+      </w:r>
+      <w:r>
+        <w:t>"Implementa este script siguiendo esta estructura: [pegas el plan]". Claude Code llama a generador.py y lo construye.</w:t>
+      </w:r>
+    </w:p>
+    <w:p>
+      <w:pPr>
+        <w:ind w:left="283"/>
+      </w:pPr>
+      <w:r>
+        <w:rPr>
+          <w:b/>
+          <w:color w:val="1F497D"/>
+        </w:rPr>
+        <w:t xml:space="preserve">Resultado:  </w:t>
+      </w:r>
+      <w:r>
+        <w:t>Script completo, con convenciones Egakat, listo en minutos.</w:t>
+      </w:r>
+    </w:p>
+    <w:p/>
+    <w:p>
+      <w:pPr>
+        <w:spacing w:before="80" w:after="80"/>
+        <w:ind w:left="283"/>
+      </w:pPr>
+      <w:r>
+        <w:rPr>
+          <w:b/>
+          <w:color w:val="1F497D"/>
+        </w:rPr>
+        <w:t xml:space="preserve">Importante:  </w:t>
+      </w:r>
+      <w:r>
+        <w:rPr>
+          <w:color w:val="323232"/>
+        </w:rPr>
+        <w:t>Claude.ai NO tiene acceso a C:\ClaudeWork\. Si le muestras código, debes pegarlo tú. Por eso el filtro de seguridad (ask_ai y los agentes) sanitiza antes de enviar — pero con Claude.ai en el navegador, TÚ eres el filtro. Nunca pegues el contenido de tu .env directamente en Claude.ai.</w:t>
+      </w:r>
+    </w:p>
+    <w:p/>
+    <w:p>
+      <w:r>
+        <w:br w:type="page"/>
+      </w:r>
+    </w:p>
+    <w:p>
+      <w:pPr>
+        <w:pStyle w:val="Heading1"/>
+      </w:pPr>
+      <w:r>
+        <w:rPr>
+          <w:color w:val="1F497D"/>
+        </w:rPr>
+        <w:t>3. Cómo Claude Code orquesta los agentes</w:t>
       </w:r>
     </w:p>
     <w:p>
@@ -627,7 +1500,7 @@
         <w:rPr>
           <w:color w:val="1F497D"/>
         </w:rPr>
-        <w:t>3. ask_ai vs Claude Code — cuándo usar cada uno</w:t>
+        <w:t>4. ask_ai vs Claude Code — cuándo usar cada uno</w:t>
       </w:r>
     </w:p>
     <w:p>
@@ -1009,7 +1882,7 @@
         <w:rPr>
           <w:color w:val="1F497D"/>
         </w:rPr>
-        <w:t>4. Tu rol como usuario — qué debes hacer tú</w:t>
+        <w:t>5. Tu rol como usuario — qué debes hacer tú</w:t>
       </w:r>
     </w:p>
     <w:p>
@@ -1219,7 +2092,7 @@
         <w:rPr>
           <w:color w:val="1F497D"/>
         </w:rPr>
-        <w:t>5. Cómo iniciar ante un proyecto o tarea nueva</w:t>
+        <w:t>6. Cómo iniciar ante un proyecto o tarea nueva</w:t>
       </w:r>
     </w:p>
     <w:p>
@@ -1413,7 +2286,7 @@
         <w:rPr>
           <w:color w:val="1F497D"/>
         </w:rPr>
-        <w:t>6. Qué es automático y qué requiere tu intervención</w:t>
+        <w:t>7. Qué es automático y qué requiere tu intervención</w:t>
       </w:r>
     </w:p>
     <w:tbl>
@@ -1769,7 +2642,7 @@
         <w:rPr>
           <w:color w:val="1F497D"/>
         </w:rPr>
-        <w:t>7. Referencia rápida — todos los comandos</w:t>
+        <w:t>8. Referencia rápida — todos los comandos</w:t>
       </w:r>
     </w:p>
     <w:p>
@@ -2859,7 +3732,7 @@
         <w:rPr>
           <w:color w:val="1F497D"/>
         </w:rPr>
-        <w:t>8. Ahorro de tokens — tus archivos reales</w:t>
+        <w:t>9. Ahorro de tokens — tus archivos reales</w:t>
       </w:r>
     </w:p>
     <w:tbl>
@@ -3329,7 +4202,7 @@
         <w:rPr>
           <w:color w:val="1F497D"/>
         </w:rPr>
-        <w:t>9. Seguridad — filtro automático de credenciales</w:t>
+        <w:t>10. Seguridad — filtro automático de credenciales</w:t>
       </w:r>
     </w:p>
     <w:p>
@@ -3550,7 +4423,7 @@
         <w:rPr>
           <w:color w:val="1F497D"/>
         </w:rPr>
-        <w:t>10. Estado actual del laboratorio</w:t>
+        <w:t>11. Estado actual del laboratorio</w:t>
       </w:r>
     </w:p>
     <w:tbl>

</xml_diff>